<commit_message>
Reword difficulties: pump set limited to excessive water, new equipment needed
Co-Authored-By: Claude Fable 5 <noreply@anthropic.com>
Claude-Session: https://claude.ai/code/session_01WY9A2tpjL1a11mvBGrACvf
</commit_message>
<xml_diff>
--- a/reports/Dewatering_Trial_Report_Simple.docx
+++ b/reports/Dewatering_Trial_Report_Simple.docx
@@ -343,7 +343,7 @@
           </w:tcPr>
           <w:p>
             <w:r>
-              <w:t>Bulk water pumped out. About 50 mm of water left in every pit.</w:t>
+              <w:t>Excessive water pumped out. Not possible to drain the last ~50 mm with the available pump set.</w:t>
             </w:r>
           </w:p>
         </w:tc>
@@ -395,7 +395,7 @@
           </w:tcPr>
           <w:p>
             <w:r>
-              <w:t>Bulk water pumped out. About 50 mm of water left in every pit.</w:t>
+              <w:t>Excessive water pumped out. Not possible to drain the last ~50 mm with the available pump set.</w:t>
             </w:r>
           </w:p>
         </w:tc>
@@ -408,7 +408,7 @@
           <w:b w:val="0"/>
           <w:sz w:val="22"/>
         </w:rPr>
-        <w:t>The target for dewatering is a dry chamber, because the whole point of the activity is to protect the primary cable joints and allow IR testing and cable connection works. On that basis, none of the manholes attempted over the two days were completed. The pump removed the bulk of the water in each pit, but a layer of roughly 50 mm always remained on the floor, sitting directly on the cable loops and joints.</w:t>
+        <w:t>The target for dewatering is a dry chamber, because the whole point of the activity is to protect the primary cable joints and allow IR testing and cable connection works. On that basis, none of the manholes attempted over the two days were completed. The pump set removed the excessive water in each pit, but it was not possible to drain the lower level – a layer of roughly 50 mm always remained on the floor, sitting directly on the cable loops and joints.</w:t>
       </w:r>
     </w:p>
     <w:p>
@@ -701,10 +701,10 @@
         <w:rPr>
           <w:b/>
         </w:rPr>
-        <w:t xml:space="preserve">Residual water the pump cannot lift. </w:t>
+        <w:t xml:space="preserve">Not possible to drain the pits fully with the current pump set. </w:t>
       </w:r>
       <w:r>
-        <w:t>The portable pump is a centrifugal submersible type. Once the water level drops to about 50 mm above the pit floor it starts drawing air and loses suction, so it cannot go lower. This is a limitation of the pump type itself, not a fault of the operators or the setup. The 50 mm left behind is exactly the layer that keeps the cable joints wet (Photos 2 and 3).</w:t>
+        <w:t>The pump set available on site is only capable of dewatering the excessive water. Once the level drops to about 50 mm above the pit floor, the pump starts drawing air and loses suction, so it is not possible to drain the lower level of water with this equipment. This is a limitation of the pump type itself, not a fault of the operators or the setup, and the layer left behind is exactly the layer keeping the cable joints wet (Photos 2 and 3). New equipment capable of draining this lower level (a residue/puddle pump or vacuum extraction) needs to be made available or arranged before the activity can succeed.</w:t>
       </w:r>
     </w:p>
     <w:p>
@@ -715,10 +715,10 @@
         <w:rPr>
           <w:b/>
         </w:rPr>
-        <w:t xml:space="preserve">Wet-vacuum too slow for the job. </w:t>
+        <w:t xml:space="preserve">Wet-vacuum not able to clear the leftover layer. </w:t>
       </w:r>
       <w:r>
-        <w:t>We tried finishing each pit with a small wet-vacuum (Photo 4). With a 20-litre drum against about 70 litres of leftover water per pit, each pit needs 3 to 4 fill-and-empty rounds, roughly 15 to 20 minutes of vacuuming alone. Across a group of 13 to 18 manholes, that alone is more time than the 2.5-hour closure window allows. The silt in the water also clogs the vacuum filter, so it gets slower pit after pit, and from the surface it cannot reach the low spots and duct mouths around the cables.</w:t>
+        <w:t>We tried finishing each pit with a small wet-vacuum (Photo 4), but it is not a practical solution for this volume of water. The drum is about 20 litres against roughly 70 litres of leftover water per pit, so each pit needs several fill-and-empty rounds. The silt in the water also clogs the vacuum filter pit after pit, and from the surface it cannot reach the low spots and duct mouths around the cables, so pockets of water always remain.</w:t>
       </w:r>
     </w:p>
     <w:p>

</xml_diff>